<commit_message>
Update English content files and regenerate all output formats for 2026-04-13 release
</commit_message>
<xml_diff>
--- a/eng/docx/020.content.docx
+++ b/eng/docx/020.content.docx
@@ -54929,7 +54929,7 @@
         <w:rPr>
           <w:lang w:val="en_US" w:bidi="en_US"/>
         </w:rPr>
-        <w:t>Tree placed by God in the midst of the Garden of Eden (</w:t>
+        <w:t>The tree of life is a special tree that God placed in the middle of the garden of Eden, the first place where God put humans (</w:t>
       </w:r>
       <w:hyperlink r:id="rId1077">
         <w:r>
@@ -54940,14 +54940,14 @@
             <w:color w:val="0000EE"/>
             <w:u w:val="single"/>
           </w:rPr>
-          <w:t>Gn 2:8–9</w:t>
-        </w:r>
-      </w:hyperlink>
-      <w:r>
-        <w:rPr>
-          <w:lang w:val="en_US" w:bidi="en_US"/>
-        </w:rPr>
-        <w:t xml:space="preserve">), a tree whose fruit could give eternal life. God told Adam that he could eat from every tree of the Garden except the tree of the knowledge of good and evil (vv </w:t>
+          <w:t>Genesis 2:8–9</w:t>
+        </w:r>
+      </w:hyperlink>
+      <w:r>
+        <w:rPr>
+          <w:lang w:val="en_US" w:bidi="en_US"/>
+        </w:rPr>
+        <w:t xml:space="preserve">). Its fruit had the power to give eternal life. God told Adam, the first man, that he could eat from every tree in the garden except the tree of the knowledge of good and evil (verses </w:t>
       </w:r>
       <w:hyperlink r:id="rId1078">
         <w:r>
@@ -54965,7 +54965,7 @@
         <w:rPr>
           <w:lang w:val="en_US" w:bidi="en_US"/>
         </w:rPr>
-        <w:t>). When Adam and Eve disobeyed God by eating from the tree of the knowledge of good and evil, they were expelled from the garden lest they “take also of the tree of life, and eat, and live for ever” (</w:t>
+        <w:t>). When Adam and Eve, the first man and woman, disobeyed God and ate from that tree, God sent them out of the garden. This prevented them from also eating from the tree of life and living forever (</w:t>
       </w:r>
       <w:hyperlink r:id="rId1079">
         <w:r>
@@ -54983,21 +54983,32 @@
         <w:rPr>
           <w:lang w:val="en_US" w:bidi="en_US"/>
         </w:rPr>
-        <w:t>).</w:t>
-      </w:r>
-    </w:p>
-    <w:p>
-      <w:pPr/>
-      <w:r>
-        <w:rPr>
-          <w:lang w:val="en_US" w:bidi="en_US"/>
-        </w:rPr>
-      </w:r>
-      <w:r>
-        <w:rPr>
-          <w:lang w:val="en_US" w:bidi="en_US"/>
-        </w:rPr>
-        <w:t>The Genesis narrative suggests that God intended the tree of life to provide Adam and Eve with a symbol of life in fellowship with and dependence on him. Human life, as distinguished from that of the animals, is much more than merely biological; it is also spiritual—it finds its deepest fulfillment in fellowship with God. Life in the fullness of its physical and spiritual dimensions, however, could remain a person’s possession only so long as he or she remained obedient to God’s command (</w:t>
+        <w:t xml:space="preserve">). </w:t>
+      </w:r>
+    </w:p>
+    <w:p>
+      <w:pPr>
+        <w:pStyle w:val="Heading3"/>
+      </w:pPr>
+      <w:r>
+        <w:rPr>
+          <w:lang w:val="en_US" w:bidi="en_US"/>
+        </w:rPr>
+        <w:t>The Tree of Life in Genesis</w:t>
+      </w:r>
+    </w:p>
+    <w:p>
+      <w:pPr/>
+      <w:r>
+        <w:rPr>
+          <w:lang w:val="en_US" w:bidi="en_US"/>
+        </w:rPr>
+      </w:r>
+      <w:r>
+        <w:rPr>
+          <w:lang w:val="en_US" w:bidi="en_US"/>
+        </w:rPr>
+        <w:t>The story in Genesis shows that the tree of life represents life in close relationship with God and trust in him. Human life is not only physical, like the life of animals, but also spiritual. It reaches its full meaning in relationship with God. Full life, both physical and spiritual, could continue only as long as people obeyed God’s command (</w:t>
       </w:r>
       <w:hyperlink r:id="rId1080">
         <w:r>
@@ -55008,14 +55019,69 @@
             <w:color w:val="0000EE"/>
             <w:u w:val="single"/>
           </w:rPr>
-          <w:t>Gn 2:17</w:t>
-        </w:r>
-      </w:hyperlink>
-      <w:r>
-        <w:rPr>
-          <w:lang w:val="en_US" w:bidi="en_US"/>
-        </w:rPr>
-        <w:t xml:space="preserve">). Apart from Genesis, the only other OT occurrences of the phrase the “tree of life” are found in Proverbs (quoted here from rsv), where it symbolizes the enrichment of life in various ways. In </w:t>
+          <w:t>Genesis 2:17</w:t>
+        </w:r>
+      </w:hyperlink>
+      <w:r>
+        <w:rPr>
+          <w:lang w:val="en_US" w:bidi="en_US"/>
+        </w:rPr>
+        <w:t xml:space="preserve">). </w:t>
+      </w:r>
+    </w:p>
+    <w:p>
+      <w:pPr>
+        <w:pStyle w:val="Heading3"/>
+      </w:pPr>
+      <w:r>
+        <w:rPr>
+          <w:lang w:val="en_US" w:bidi="en_US"/>
+        </w:rPr>
+        <w:t>The Tree of Life in Proverbs</w:t>
+      </w:r>
+    </w:p>
+    <w:p>
+      <w:pPr/>
+      <w:r>
+        <w:rPr>
+          <w:lang w:val="en_US" w:bidi="en_US"/>
+        </w:rPr>
+      </w:r>
+      <w:r>
+        <w:rPr>
+          <w:lang w:val="en_US" w:bidi="en_US"/>
+        </w:rPr>
+        <w:t>Apart from Genesis, the phrase tree of life appears only in the book of Proverbs. There, it is used as a symbol for things that give life, help, and well-being. For example:</w:t>
+      </w:r>
+    </w:p>
+    <w:p>
+      <w:pPr>
+        <w:pStyle w:val="ListBullet"/>
+        <w:spacing w:line="240" w:lineRule="auto"/>
+        <w:ind w:left="720"/>
+      </w:pPr>
+      <w:r>
+        <w:rPr>
+          <w:lang w:val="en_US" w:bidi="en_US"/>
+        </w:rPr>
+      </w:r>
+      <w:r>
+        <w:rPr>
+          <w:lang w:val="en_US" w:bidi="en_US"/>
+        </w:rPr>
+        <w:t>wisdom is "</w:t>
+      </w:r>
+      <w:r>
+        <w:rPr>
+          <w:lang w:val="en_US" w:bidi="en_US"/>
+        </w:rPr>
+        <w:t xml:space="preserve">a tree of life to those who embrace her" </w:t>
+      </w:r>
+      <w:r>
+        <w:rPr>
+          <w:lang w:val="en_US" w:bidi="en_US"/>
+        </w:rPr>
+        <w:t>(</w:t>
       </w:r>
       <w:hyperlink r:id="rId1081">
         <w:r>
@@ -55033,7 +55099,31 @@
         <w:rPr>
           <w:lang w:val="en_US" w:bidi="en_US"/>
         </w:rPr>
-        <w:t xml:space="preserve"> wisdom is referred to as “a tree of life to those who lay hold of her”; in </w:t>
+        <w:t xml:space="preserve">); </w:t>
+      </w:r>
+    </w:p>
+    <w:p>
+      <w:pPr>
+        <w:pStyle w:val="ListBullet"/>
+        <w:spacing w:line="240" w:lineRule="auto"/>
+        <w:ind w:left="720"/>
+      </w:pPr>
+      <w:r>
+        <w:rPr>
+          <w:lang w:val="en_US" w:bidi="en_US"/>
+        </w:rPr>
+      </w:r>
+      <w:r>
+        <w:rPr>
+          <w:lang w:val="en_US" w:bidi="en_US"/>
+        </w:rPr>
+        <w:t>"the fruit of the righteous is a tree of life"</w:t>
+      </w:r>
+      <w:r>
+        <w:rPr>
+          <w:lang w:val="en_US" w:bidi="en_US"/>
+        </w:rPr>
+        <w:t xml:space="preserve"> (</w:t>
       </w:r>
       <w:hyperlink r:id="rId1082">
         <w:r>
@@ -55051,7 +55141,25 @@
         <w:rPr>
           <w:lang w:val="en_US" w:bidi="en_US"/>
         </w:rPr>
-        <w:t xml:space="preserve"> “the fruit of the righteous is a tree of life”; in </w:t>
+        <w:t>);</w:t>
+      </w:r>
+    </w:p>
+    <w:p>
+      <w:pPr>
+        <w:pStyle w:val="ListBullet"/>
+        <w:spacing w:line="240" w:lineRule="auto"/>
+        <w:ind w:left="720"/>
+      </w:pPr>
+      <w:r>
+        <w:rPr>
+          <w:lang w:val="en_US" w:bidi="en_US"/>
+        </w:rPr>
+      </w:r>
+      <w:r>
+        <w:rPr>
+          <w:lang w:val="en_US" w:bidi="en_US"/>
+        </w:rPr>
+        <w:t>a fulfilled desire is like “a tree of life” (</w:t>
       </w:r>
       <w:hyperlink r:id="rId1083">
         <w:r>
@@ -55069,7 +55177,25 @@
         <w:rPr>
           <w:lang w:val="en_US" w:bidi="en_US"/>
         </w:rPr>
-        <w:t xml:space="preserve"> a fulfilled desire is as “a tree of life”; and in </w:t>
+        <w:t>); and</w:t>
+      </w:r>
+    </w:p>
+    <w:p>
+      <w:pPr>
+        <w:pStyle w:val="ListBullet"/>
+        <w:spacing w:line="240" w:lineRule="auto"/>
+        <w:ind w:left="720"/>
+      </w:pPr>
+      <w:r>
+        <w:rPr>
+          <w:lang w:val="en_US" w:bidi="en_US"/>
+        </w:rPr>
+      </w:r>
+      <w:r>
+        <w:rPr>
+          <w:lang w:val="en_US" w:bidi="en_US"/>
+        </w:rPr>
+        <w:t>“a soothing tongue is a tree of life” (</w:t>
       </w:r>
       <w:hyperlink r:id="rId1084">
         <w:r>
@@ -55087,21 +55213,32 @@
         <w:rPr>
           <w:lang w:val="en_US" w:bidi="en_US"/>
         </w:rPr>
-        <w:t xml:space="preserve"> “a gentle tongue is a tree of life.”</w:t>
-      </w:r>
-    </w:p>
-    <w:p>
-      <w:pPr/>
-      <w:r>
-        <w:rPr>
-          <w:lang w:val="en_US" w:bidi="en_US"/>
-        </w:rPr>
-      </w:r>
-      <w:r>
-        <w:rPr>
-          <w:lang w:val="en_US" w:bidi="en_US"/>
-        </w:rPr>
-        <w:t>The book of Revelation contains the only references to the tree of life in the NT (</w:t>
+        <w:t xml:space="preserve">). </w:t>
+      </w:r>
+    </w:p>
+    <w:p>
+      <w:pPr>
+        <w:pStyle w:val="Heading3"/>
+      </w:pPr>
+      <w:r>
+        <w:rPr>
+          <w:lang w:val="en_US" w:bidi="en_US"/>
+        </w:rPr>
+        <w:t>The Tree of Life in Revelation</w:t>
+      </w:r>
+    </w:p>
+    <w:p>
+      <w:pPr/>
+      <w:r>
+        <w:rPr>
+          <w:lang w:val="en_US" w:bidi="en_US"/>
+        </w:rPr>
+      </w:r>
+      <w:r>
+        <w:rPr>
+          <w:lang w:val="en_US" w:bidi="en_US"/>
+        </w:rPr>
+        <w:t>Later, in the New Testament, the tree of life appears only in the book of Revelation (</w:t>
       </w:r>
       <w:hyperlink r:id="rId1085">
         <w:r>
@@ -55112,7 +55249,7 @@
             <w:color w:val="0000EE"/>
             <w:u w:val="single"/>
           </w:rPr>
-          <w:t>Rv 2:7</w:t>
+          <w:t>Revelation 2:7</w:t>
         </w:r>
       </w:hyperlink>
       <w:r>
@@ -55137,25 +55274,21 @@
         <w:rPr>
           <w:lang w:val="en_US" w:bidi="en_US"/>
         </w:rPr>
-        <w:t xml:space="preserve">). The Bible begins and ends with a Paradise in the midst of which is a tree of life. The way to the tree of life, which was closed in </w:t>
-      </w:r>
-      <w:hyperlink r:id="rId1073">
-        <w:r>
-          <w:rPr>
-            <w:lang w:val="en_US" w:bidi="en_US"/>
-          </w:rPr>
-          <w:rPr>
-            <w:color w:val="0000EE"/>
-            <w:u w:val="single"/>
-          </w:rPr>
-          <w:t>Genesis 3</w:t>
-        </w:r>
-      </w:hyperlink>
-      <w:r>
-        <w:rPr>
-          <w:lang w:val="en_US" w:bidi="en_US"/>
-        </w:rPr>
-        <w:t xml:space="preserve">, is open again for God’s believing people. This was made possible by the second Adam, Jesus Christ. Those who have washed their robes in the blood of Christ (cf. </w:t>
+        <w:t>). The Bible begins with a garden that includes the tree of life and ends with a similar picture. In Genesis, access to the tree of life was closed. In Revelation, it is open again for those who trust in God and follow him. Jesus Christ makes this possible.</w:t>
+      </w:r>
+    </w:p>
+    <w:p>
+      <w:pPr/>
+      <w:r>
+        <w:rPr>
+          <w:lang w:val="en_US" w:bidi="en_US"/>
+        </w:rPr>
+      </w:r>
+      <w:r>
+        <w:rPr>
+          <w:lang w:val="en_US" w:bidi="en_US"/>
+        </w:rPr>
+        <w:t xml:space="preserve">The second Adam, Jesus Christ, made this possible. It is for those who have washed their robes in the blood of Christ (compare </w:t>
       </w:r>
       <w:hyperlink r:id="rId1087">
         <w:r>
@@ -55166,14 +55299,14 @@
             <w:color w:val="0000EE"/>
             <w:u w:val="single"/>
           </w:rPr>
-          <w:t>Rv 7:14</w:t>
-        </w:r>
-      </w:hyperlink>
-      <w:r>
-        <w:rPr>
-          <w:lang w:val="en_US" w:bidi="en_US"/>
-        </w:rPr>
-        <w:t>) and have sought forgiveness of their sin through the redemptive work of Christ, receive the right to the tree of life (</w:t>
+          <w:t>Revelation 7:14</w:t>
+        </w:r>
+      </w:hyperlink>
+      <w:r>
+        <w:rPr>
+          <w:lang w:val="en_US" w:bidi="en_US"/>
+        </w:rPr>
+        <w:t>). It is for those who have sought forgiveness of their sin through the redemptive work of Christ. These people receive the right to the tree of life (</w:t>
       </w:r>
       <w:hyperlink r:id="rId1088">
         <w:r>
@@ -55191,7 +55324,7 @@
         <w:rPr>
           <w:lang w:val="en_US" w:bidi="en_US"/>
         </w:rPr>
-        <w:t>), but the disobedient will have no access to it.</w:t>
+        <w:t>). Those who refuse to obey God do not have access to it.</w:t>
       </w:r>
     </w:p>
     <w:p>

</xml_diff>